<commit_message>
feat: add SRD.docx user stories attribution
</commit_message>
<xml_diff>
--- a/SRD.docx
+++ b/SRD.docx
@@ -175,7 +175,7 @@
       <w:pPr>
         <w:numPr>
           <w:ilvl w:val="0"/>
-          <w:numId w:val="4"/>
+          <w:numId w:val="6"/>
         </w:numPr>
         <w:spacing w:line="360" w:lineRule="auto"/>
         <w:ind w:left="720" w:hanging="360"/>
@@ -198,130 +198,6 @@
           <w:rtl w:val="0"/>
         </w:rPr>
         <w:t xml:space="preserve"> TYLER P — PRODUCT OWNER</w:t>
-      </w:r>
-    </w:p>
-    <w:p>
-      <w:pPr>
-        <w:numPr>
-          <w:ilvl w:val="0"/>
-          <w:numId w:val="4"/>
-        </w:numPr>
-        <w:spacing w:line="360" w:lineRule="auto"/>
-        <w:ind w:left="720" w:hanging="360"/>
-        <w:rPr>
-          <w:smallCaps w:val="1"/>
-        </w:rPr>
-      </w:pPr>
-      <w:r>
-        <w:rPr>
-          <w:b w:val="1"/>
-          <w:bCs w:val="1"/>
-          <w:smallCaps w:val="1"/>
-          <w:rtl w:val="0"/>
-        </w:rPr>
-        <w:t xml:space="preserve">STUDENT B:</w:t>
-      </w:r>
-      <w:r>
-        <w:rPr>
-          <w:smallCaps w:val="1"/>
-          <w:rtl w:val="0"/>
-        </w:rPr>
-        <w:t xml:space="preserve"> SAMAN S — LEAD ENGINEER</w:t>
-      </w:r>
-    </w:p>
-    <w:p>
-      <w:pPr>
-        <w:numPr>
-          <w:ilvl w:val="0"/>
-          <w:numId w:val="4"/>
-        </w:numPr>
-        <w:spacing w:line="360" w:lineRule="auto"/>
-        <w:ind w:left="720" w:hanging="360"/>
-        <w:rPr>
-          <w:smallCaps w:val="1"/>
-        </w:rPr>
-      </w:pPr>
-      <w:r>
-        <w:rPr>
-          <w:b w:val="1"/>
-          <w:bCs w:val="1"/>
-          <w:smallCaps w:val="1"/>
-          <w:rtl w:val="0"/>
-        </w:rPr>
-        <w:t xml:space="preserve">STUDENT C:</w:t>
-      </w:r>
-      <w:r>
-        <w:rPr>
-          <w:smallCaps w:val="1"/>
-          <w:rtl w:val="0"/>
-        </w:rPr>
-        <w:t xml:space="preserve"> YUSHA R — SCRUM MASTER</w:t>
-      </w:r>
-    </w:p>
-    <w:p>
-      <w:pPr>
-        <w:numPr>
-          <w:ilvl w:val="0"/>
-          <w:numId w:val="4"/>
-        </w:numPr>
-        <w:spacing w:line="360" w:lineRule="auto"/>
-        <w:ind w:left="720" w:hanging="360"/>
-        <w:rPr>
-          <w:smallCaps w:val="1"/>
-        </w:rPr>
-      </w:pPr>
-      <w:r>
-        <w:rPr>
-          <w:b w:val="1"/>
-          <w:bCs w:val="1"/>
-          <w:smallCaps w:val="1"/>
-          <w:rtl w:val="0"/>
-        </w:rPr>
-        <w:t xml:space="preserve">STUDENT D</w:t>
-      </w:r>
-      <w:r>
-        <w:rPr>
-          <w:smallCaps w:val="1"/>
-          <w:rtl w:val="0"/>
-        </w:rPr>
-        <w:t xml:space="preserve">: DANIEL X — TESTER</w:t>
-      </w:r>
-    </w:p>
-    <w:p>
-      <w:pPr>
-        <w:spacing w:line="360" w:lineRule="auto"/>
-        <w:rPr>
-          <w:b w:val="1"/>
-          <w:bCs w:val="1"/>
-          <w:smallCaps w:val="1"/>
-        </w:rPr>
-      </w:pPr>
-      <w:r>
-        <w:rPr>
-          <w:rtl w:val="0"/>
-        </w:rPr>
-      </w:r>
-    </w:p>
-    <w:p>
-      <w:pPr>
-        <w:spacing w:line="360" w:lineRule="auto"/>
-        <w:rPr>
-          <w:smallCaps w:val="1"/>
-        </w:rPr>
-      </w:pPr>
-      <w:r>
-        <w:rPr>
-          <w:b w:val="1"/>
-          <w:bCs w:val="1"/>
-          <w:smallCaps w:val="1"/>
-          <w:rtl w:val="0"/>
-        </w:rPr>
-        <w:t xml:space="preserve">PROJECT ASSETS:</w:t>
-      </w:r>
-      <w:r>
-        <w:rPr>
-          <w:rtl w:val="0"/>
-        </w:rPr>
       </w:r>
     </w:p>
     <w:p>
@@ -329,6 +205,130 @@
         <w:numPr>
           <w:ilvl w:val="0"/>
           <w:numId w:val="6"/>
+        </w:numPr>
+        <w:spacing w:line="360" w:lineRule="auto"/>
+        <w:ind w:left="720" w:hanging="360"/>
+        <w:rPr>
+          <w:smallCaps w:val="1"/>
+        </w:rPr>
+      </w:pPr>
+      <w:r>
+        <w:rPr>
+          <w:b w:val="1"/>
+          <w:bCs w:val="1"/>
+          <w:smallCaps w:val="1"/>
+          <w:rtl w:val="0"/>
+        </w:rPr>
+        <w:t xml:space="preserve">STUDENT B:</w:t>
+      </w:r>
+      <w:r>
+        <w:rPr>
+          <w:smallCaps w:val="1"/>
+          <w:rtl w:val="0"/>
+        </w:rPr>
+        <w:t xml:space="preserve"> SAMAN S — LEAD ENGINEER</w:t>
+      </w:r>
+    </w:p>
+    <w:p>
+      <w:pPr>
+        <w:numPr>
+          <w:ilvl w:val="0"/>
+          <w:numId w:val="6"/>
+        </w:numPr>
+        <w:spacing w:line="360" w:lineRule="auto"/>
+        <w:ind w:left="720" w:hanging="360"/>
+        <w:rPr>
+          <w:smallCaps w:val="1"/>
+        </w:rPr>
+      </w:pPr>
+      <w:r>
+        <w:rPr>
+          <w:b w:val="1"/>
+          <w:bCs w:val="1"/>
+          <w:smallCaps w:val="1"/>
+          <w:rtl w:val="0"/>
+        </w:rPr>
+        <w:t xml:space="preserve">STUDENT C:</w:t>
+      </w:r>
+      <w:r>
+        <w:rPr>
+          <w:smallCaps w:val="1"/>
+          <w:rtl w:val="0"/>
+        </w:rPr>
+        <w:t xml:space="preserve"> YUSHA R — SCRUM MASTER</w:t>
+      </w:r>
+    </w:p>
+    <w:p>
+      <w:pPr>
+        <w:numPr>
+          <w:ilvl w:val="0"/>
+          <w:numId w:val="6"/>
+        </w:numPr>
+        <w:spacing w:line="360" w:lineRule="auto"/>
+        <w:ind w:left="720" w:hanging="360"/>
+        <w:rPr>
+          <w:smallCaps w:val="1"/>
+        </w:rPr>
+      </w:pPr>
+      <w:r>
+        <w:rPr>
+          <w:b w:val="1"/>
+          <w:bCs w:val="1"/>
+          <w:smallCaps w:val="1"/>
+          <w:rtl w:val="0"/>
+        </w:rPr>
+        <w:t xml:space="preserve">STUDENT D</w:t>
+      </w:r>
+      <w:r>
+        <w:rPr>
+          <w:smallCaps w:val="1"/>
+          <w:rtl w:val="0"/>
+        </w:rPr>
+        <w:t xml:space="preserve">: DANIEL X — TESTER</w:t>
+      </w:r>
+    </w:p>
+    <w:p>
+      <w:pPr>
+        <w:spacing w:line="360" w:lineRule="auto"/>
+        <w:rPr>
+          <w:b w:val="1"/>
+          <w:bCs w:val="1"/>
+          <w:smallCaps w:val="1"/>
+        </w:rPr>
+      </w:pPr>
+      <w:r>
+        <w:rPr>
+          <w:rtl w:val="0"/>
+        </w:rPr>
+      </w:r>
+    </w:p>
+    <w:p>
+      <w:pPr>
+        <w:spacing w:line="360" w:lineRule="auto"/>
+        <w:rPr>
+          <w:smallCaps w:val="1"/>
+        </w:rPr>
+      </w:pPr>
+      <w:r>
+        <w:rPr>
+          <w:b w:val="1"/>
+          <w:bCs w:val="1"/>
+          <w:smallCaps w:val="1"/>
+          <w:rtl w:val="0"/>
+        </w:rPr>
+        <w:t xml:space="preserve">PROJECT ASSETS:</w:t>
+      </w:r>
+      <w:r>
+        <w:rPr>
+          <w:rtl w:val="0"/>
+        </w:rPr>
+      </w:r>
+    </w:p>
+    <w:p>
+      <w:pPr>
+        <w:numPr>
+          <w:ilvl w:val="0"/>
+          <w:numId w:val="8"/>
         </w:numPr>
         <w:spacing w:line="360" w:lineRule="auto"/>
         <w:ind w:left="720" w:hanging="360"/>
@@ -373,7 +373,7 @@
       <w:pPr>
         <w:numPr>
           <w:ilvl w:val="0"/>
-          <w:numId w:val="6"/>
+          <w:numId w:val="8"/>
         </w:numPr>
         <w:spacing w:line="360" w:lineRule="auto"/>
         <w:ind w:left="720" w:hanging="360"/>
@@ -655,40 +655,46 @@
             </w:pPr>
             <w:r>
               <w:rPr>
-                <w:rtl w:val="0"/>
-              </w:rPr>
-            </w:r>
-          </w:p>
-        </w:tc>
-        <w:tc>
-          <w:tcPr/>
-          <w:p>
-            <w:pPr>
-              <w:spacing w:line="360" w:lineRule="auto"/>
-              <w:rPr>
-                <w:smallCaps w:val="1"/>
-              </w:rPr>
-            </w:pPr>
-            <w:r>
-              <w:rPr>
-                <w:rtl w:val="0"/>
-              </w:rPr>
-            </w:r>
-          </w:p>
-        </w:tc>
-        <w:tc>
-          <w:tcPr/>
-          <w:p>
-            <w:pPr>
-              <w:spacing w:line="360" w:lineRule="auto"/>
-              <w:rPr>
-                <w:smallCaps w:val="1"/>
-              </w:rPr>
-            </w:pPr>
-            <w:r>
-              <w:rPr>
-                <w:rtl w:val="0"/>
-              </w:rPr>
+                <w:smallCaps w:val="1"/>
+                <w:rtl w:val="0"/>
+              </w:rPr>
+              <w:t xml:space="preserve">09/25/2026</w:t>
+            </w:r>
+          </w:p>
+        </w:tc>
+        <w:tc>
+          <w:tcPr/>
+          <w:p>
+            <w:pPr>
+              <w:spacing w:line="360" w:lineRule="auto"/>
+              <w:rPr>
+                <w:smallCaps w:val="1"/>
+              </w:rPr>
+            </w:pPr>
+            <w:r>
+              <w:rPr>
+                <w:smallCaps w:val="1"/>
+                <w:rtl w:val="0"/>
+              </w:rPr>
+              <w:t xml:space="preserve">Yusha</w:t>
+            </w:r>
+          </w:p>
+        </w:tc>
+        <w:tc>
+          <w:tcPr/>
+          <w:p>
+            <w:pPr>
+              <w:spacing w:line="360" w:lineRule="auto"/>
+              <w:rPr>
+                <w:smallCaps w:val="1"/>
+              </w:rPr>
+            </w:pPr>
+            <w:r>
+              <w:rPr>
+                <w:smallCaps w:val="1"/>
+                <w:rtl w:val="0"/>
+              </w:rPr>
+              <w:t xml:space="preserve">Added user stories attribution</w:t>
             </w:r>
           </w:p>
         </w:tc>
@@ -936,6 +942,11 @@
         </w:rPr>
         <w:t xml:space="preserve">INTRODUCTION ...................................................................................... [PAGE #]</w:t>
       </w:r>
+      <w:r>
+        <w:rPr>
+          <w:rtl w:val="0"/>
+        </w:rPr>
+      </w:r>
     </w:p>
     <w:p>
       <w:pPr>
@@ -961,6 +972,11 @@
         </w:rPr>
         <w:t xml:space="preserve">1.1 PROJECT PURPOSE</w:t>
       </w:r>
+      <w:r>
+        <w:rPr>
+          <w:rtl w:val="0"/>
+        </w:rPr>
+      </w:r>
     </w:p>
     <w:p>
       <w:pPr>
@@ -986,6 +1002,11 @@
         </w:rPr>
         <w:t xml:space="preserve">1.2 INTENDED AUDIENCE</w:t>
       </w:r>
+      <w:r>
+        <w:rPr>
+          <w:rtl w:val="0"/>
+        </w:rPr>
+      </w:r>
     </w:p>
     <w:p>
       <w:pPr>
@@ -1011,6 +1032,11 @@
         </w:rPr>
         <w:t xml:space="preserve">1.3 PROJECT SCOPE</w:t>
       </w:r>
+      <w:r>
+        <w:rPr>
+          <w:rtl w:val="0"/>
+        </w:rPr>
+      </w:r>
     </w:p>
     <w:p>
       <w:pPr>
@@ -1036,6 +1062,11 @@
         </w:rPr>
         <w:t xml:space="preserve">USER STORIES ..................................................................................... [PAGE #]</w:t>
       </w:r>
+      <w:r>
+        <w:rPr>
+          <w:rtl w:val="0"/>
+        </w:rPr>
+      </w:r>
     </w:p>
     <w:p>
       <w:pPr>
@@ -1061,6 +1092,11 @@
         </w:rPr>
         <w:t xml:space="preserve">2.1 USER FEATURES (THE "SHALL" STATEMENTS)</w:t>
       </w:r>
+      <w:r>
+        <w:rPr>
+          <w:rtl w:val="0"/>
+        </w:rPr>
+      </w:r>
     </w:p>
     <w:p>
       <w:pPr>
@@ -1086,6 +1122,11 @@
         </w:rPr>
         <w:t xml:space="preserve">2.2 ADMIN FEATURES</w:t>
       </w:r>
+      <w:r>
+        <w:rPr>
+          <w:rtl w:val="0"/>
+        </w:rPr>
+      </w:r>
     </w:p>
     <w:p>
       <w:pPr>
@@ -1111,6 +1152,11 @@
         </w:rPr>
         <w:t xml:space="preserve">FUNCTIONAL REQUIREMENTS....................................................... [PAGE #]</w:t>
       </w:r>
+      <w:r>
+        <w:rPr>
+          <w:rtl w:val="0"/>
+        </w:rPr>
+      </w:r>
     </w:p>
     <w:p>
       <w:pPr>
@@ -1136,6 +1182,11 @@
         </w:rPr>
         <w:t xml:space="preserve">NON-FUNCTIONAL REQUIREMENTS ............................................ [PAGE #]</w:t>
       </w:r>
+      <w:r>
+        <w:rPr>
+          <w:rtl w:val="0"/>
+        </w:rPr>
+      </w:r>
     </w:p>
     <w:p>
       <w:pPr>
@@ -1161,6 +1212,11 @@
         </w:rPr>
         <w:t xml:space="preserve">4.1 DATA INTEGRITY &amp; SECURITY</w:t>
       </w:r>
+      <w:r>
+        <w:rPr>
+          <w:rtl w:val="0"/>
+        </w:rPr>
+      </w:r>
     </w:p>
     <w:p>
       <w:pPr>
@@ -1186,6 +1242,11 @@
         </w:rPr>
         <w:t xml:space="preserve">4.2 PERFORMANCE &amp; USABILITY</w:t>
       </w:r>
+      <w:r>
+        <w:rPr>
+          <w:rtl w:val="0"/>
+        </w:rPr>
+      </w:r>
     </w:p>
     <w:p>
       <w:pPr>
@@ -1211,6 +1272,11 @@
         </w:rPr>
         <w:t xml:space="preserve">SYSTEM ARCHITECTURE ................................................................ [PAGE #]</w:t>
       </w:r>
+      <w:r>
+        <w:rPr>
+          <w:rtl w:val="0"/>
+        </w:rPr>
+      </w:r>
     </w:p>
     <w:p>
       <w:pPr>
@@ -1236,6 +1302,11 @@
         </w:rPr>
         <w:t xml:space="preserve">5.1 REST API ENDPOINTS</w:t>
       </w:r>
+      <w:r>
+        <w:rPr>
+          <w:rtl w:val="0"/>
+        </w:rPr>
+      </w:r>
     </w:p>
     <w:p>
       <w:pPr>
@@ -1261,6 +1332,11 @@
         </w:rPr>
         <w:t xml:space="preserve">5.2 DATABASE SCHEMA (MYSQL)</w:t>
       </w:r>
+      <w:r>
+        <w:rPr>
+          <w:rtl w:val="0"/>
+        </w:rPr>
+      </w:r>
     </w:p>
     <w:p>
       <w:pPr>
@@ -1286,6 +1362,11 @@
         </w:rPr>
         <w:t xml:space="preserve">USER INTERFACE (UI) ...................................................................... [PAGE #]</w:t>
       </w:r>
+      <w:r>
+        <w:rPr>
+          <w:rtl w:val="0"/>
+        </w:rPr>
+      </w:r>
     </w:p>
     <w:p>
       <w:pPr>
@@ -1311,6 +1392,11 @@
         </w:rPr>
         <w:t xml:space="preserve">6.1 WIREFRAMES / MOCKUPS</w:t>
       </w:r>
+      <w:r>
+        <w:rPr>
+          <w:rtl w:val="0"/>
+        </w:rPr>
+      </w:r>
     </w:p>
     <w:p>
       <w:pPr>
@@ -1336,6 +1422,11 @@
         </w:rPr>
         <w:t xml:space="preserve">DATA REQUIREMENTS ..................................................................... [PAGE #]</w:t>
       </w:r>
+      <w:r>
+        <w:rPr>
+          <w:rtl w:val="0"/>
+        </w:rPr>
+      </w:r>
     </w:p>
     <w:p>
       <w:pPr>
@@ -1361,6 +1452,11 @@
         </w:rPr>
         <w:t xml:space="preserve">7.1 LIST OF PERSISTENT DATA</w:t>
       </w:r>
+      <w:r>
+        <w:rPr>
+          <w:rtl w:val="0"/>
+        </w:rPr>
+      </w:r>
     </w:p>
     <w:p>
       <w:pPr>
@@ -1386,6 +1482,11 @@
         </w:rPr>
         <w:t xml:space="preserve">TRACEABILITY MATRIX ................................................................. [PAGE #]</w:t>
       </w:r>
+      <w:r>
+        <w:rPr>
+          <w:rtl w:val="0"/>
+        </w:rPr>
+      </w:r>
     </w:p>
     <w:p>
       <w:pPr>
@@ -1410,6 +1511,11 @@
           <w:rtl w:val="0"/>
         </w:rPr>
         <w:t xml:space="preserve">APPENDICES ....................................................................................... [PAGE #]</w:t>
+      </w:r>
+      <w:r>
+        <w:rPr>
+          <w:rtl w:val="0"/>
+        </w:rPr>
       </w:r>
     </w:p>
     <w:p>
@@ -1473,7 +1579,7 @@
         <w:widowControl w:val="0"/>
         <w:numPr>
           <w:ilvl w:val="0"/>
-          <w:numId w:val="5"/>
+          <w:numId w:val="7"/>
         </w:numPr>
         <w:pBdr>
           <w:top w:space="0" w:sz="0" w:val="nil"/>
@@ -1530,7 +1636,7 @@
       <w:pPr>
         <w:numPr>
           <w:ilvl w:val="0"/>
-          <w:numId w:val="7"/>
+          <w:numId w:val="9"/>
         </w:numPr>
         <w:spacing w:line="360" w:lineRule="auto"/>
         <w:ind w:left="720" w:hanging="360"/>
@@ -1560,7 +1666,7 @@
       <w:pPr>
         <w:numPr>
           <w:ilvl w:val="0"/>
-          <w:numId w:val="7"/>
+          <w:numId w:val="9"/>
         </w:numPr>
         <w:spacing w:line="360" w:lineRule="auto"/>
         <w:ind w:left="720" w:hanging="360"/>
@@ -1598,7 +1704,7 @@
       <w:pPr>
         <w:numPr>
           <w:ilvl w:val="0"/>
-          <w:numId w:val="7"/>
+          <w:numId w:val="9"/>
         </w:numPr>
         <w:spacing w:line="360" w:lineRule="auto"/>
         <w:ind w:left="720" w:hanging="360"/>
@@ -1623,13 +1729,18 @@
           <w:rtl w:val="0"/>
         </w:rPr>
         <w:t xml:space="preserve"> WHO ARE THE STAKEHOLDERS?</w:t>
+      </w:r>
+      <w:r>
+        <w:rPr>
+          <w:rtl w:val="0"/>
+        </w:rPr>
       </w:r>
     </w:p>
     <w:p>
       <w:pPr>
         <w:numPr>
           <w:ilvl w:val="0"/>
-          <w:numId w:val="7"/>
+          <w:numId w:val="9"/>
         </w:numPr>
         <w:spacing w:line="360" w:lineRule="auto"/>
         <w:ind w:left="720" w:hanging="360"/>
@@ -1654,6 +1765,11 @@
           <w:rtl w:val="0"/>
         </w:rPr>
         <w:t xml:space="preserve"> WHAT IS THE SCOPE OF THIS PROJECT?</w:t>
+      </w:r>
+      <w:r>
+        <w:rPr>
+          <w:rtl w:val="0"/>
+        </w:rPr>
       </w:r>
     </w:p>
     <w:p>
@@ -1664,7 +1780,7 @@
         <w:widowControl w:val="0"/>
         <w:numPr>
           <w:ilvl w:val="0"/>
-          <w:numId w:val="5"/>
+          <w:numId w:val="7"/>
         </w:numPr>
         <w:pBdr>
           <w:top w:space="0" w:sz="0" w:val="nil"/>
@@ -1711,6 +1827,11 @@
         </w:rPr>
         <w:t xml:space="preserve">USER STORIES</w:t>
       </w:r>
+      <w:r>
+        <w:rPr>
+          <w:rtl w:val="0"/>
+        </w:rPr>
+      </w:r>
     </w:p>
     <w:p>
       <w:pPr>
@@ -1762,7 +1883,7 @@
       <w:pPr>
         <w:numPr>
           <w:ilvl w:val="0"/>
-          <w:numId w:val="8"/>
+          <w:numId w:val="10"/>
         </w:numPr>
         <w:spacing w:line="360" w:lineRule="auto"/>
         <w:ind w:left="720" w:hanging="360"/>
@@ -1787,13 +1908,18 @@
           <w:rtl w:val="0"/>
         </w:rPr>
         <w:t xml:space="preserve"> CREATING HOUSEHOLD</w:t>
+      </w:r>
+      <w:r>
+        <w:rPr>
+          <w:rtl w:val="0"/>
+        </w:rPr>
       </w:r>
     </w:p>
     <w:p>
       <w:pPr>
         <w:numPr>
           <w:ilvl w:val="0"/>
-          <w:numId w:val="8"/>
+          <w:numId w:val="10"/>
         </w:numPr>
         <w:spacing w:line="360" w:lineRule="auto"/>
         <w:ind w:left="720" w:hanging="360"/>
@@ -1818,13 +1944,18 @@
           <w:rtl w:val="0"/>
         </w:rPr>
         <w:t xml:space="preserve"> EDITING HOUSEHOLD</w:t>
+      </w:r>
+      <w:r>
+        <w:rPr>
+          <w:rtl w:val="0"/>
+        </w:rPr>
       </w:r>
     </w:p>
     <w:p>
       <w:pPr>
         <w:numPr>
           <w:ilvl w:val="0"/>
-          <w:numId w:val="8"/>
+          <w:numId w:val="10"/>
         </w:numPr>
         <w:spacing w:line="360" w:lineRule="auto"/>
         <w:ind w:left="720" w:hanging="360"/>
@@ -1849,13 +1980,18 @@
           <w:rtl w:val="0"/>
         </w:rPr>
         <w:t xml:space="preserve"> CREATING LIST</w:t>
+      </w:r>
+      <w:r>
+        <w:rPr>
+          <w:rtl w:val="0"/>
+        </w:rPr>
       </w:r>
     </w:p>
     <w:p>
       <w:pPr>
         <w:numPr>
           <w:ilvl w:val="0"/>
-          <w:numId w:val="8"/>
+          <w:numId w:val="10"/>
         </w:numPr>
         <w:spacing w:line="360" w:lineRule="auto"/>
         <w:ind w:left="720" w:hanging="360"/>
@@ -1880,13 +2016,18 @@
           <w:rtl w:val="0"/>
         </w:rPr>
         <w:t xml:space="preserve"> EDITING LIST</w:t>
+      </w:r>
+      <w:r>
+        <w:rPr>
+          <w:rtl w:val="0"/>
+        </w:rPr>
       </w:r>
     </w:p>
     <w:p>
       <w:pPr>
         <w:numPr>
           <w:ilvl w:val="0"/>
-          <w:numId w:val="8"/>
+          <w:numId w:val="10"/>
         </w:numPr>
         <w:spacing w:line="360" w:lineRule="auto"/>
         <w:ind w:left="720" w:hanging="360"/>
@@ -1911,13 +2052,18 @@
           <w:rtl w:val="0"/>
         </w:rPr>
         <w:t xml:space="preserve"> ADDING TRIPS</w:t>
+      </w:r>
+      <w:r>
+        <w:rPr>
+          <w:rtl w:val="0"/>
+        </w:rPr>
       </w:r>
     </w:p>
     <w:p>
       <w:pPr>
         <w:numPr>
           <w:ilvl w:val="0"/>
-          <w:numId w:val="8"/>
+          <w:numId w:val="10"/>
         </w:numPr>
         <w:spacing w:line="360" w:lineRule="auto"/>
         <w:ind w:left="720" w:hanging="360"/>
@@ -1942,13 +2088,18 @@
           <w:rtl w:val="0"/>
         </w:rPr>
         <w:t xml:space="preserve"> RECORDING PRICE</w:t>
+      </w:r>
+      <w:r>
+        <w:rPr>
+          <w:rtl w:val="0"/>
+        </w:rPr>
       </w:r>
     </w:p>
     <w:p>
       <w:pPr>
         <w:numPr>
           <w:ilvl w:val="0"/>
-          <w:numId w:val="8"/>
+          <w:numId w:val="10"/>
         </w:numPr>
         <w:spacing w:line="360" w:lineRule="auto"/>
         <w:ind w:left="720" w:hanging="360"/>
@@ -1973,13 +2124,18 @@
           <w:rtl w:val="0"/>
         </w:rPr>
         <w:t xml:space="preserve"> RECORDING USERS</w:t>
+      </w:r>
+      <w:r>
+        <w:rPr>
+          <w:rtl w:val="0"/>
+        </w:rPr>
       </w:r>
     </w:p>
     <w:p>
       <w:pPr>
         <w:numPr>
           <w:ilvl w:val="0"/>
-          <w:numId w:val="8"/>
+          <w:numId w:val="10"/>
         </w:numPr>
         <w:spacing w:line="360" w:lineRule="auto"/>
         <w:ind w:left="720" w:hanging="360"/>
@@ -2004,13 +2160,18 @@
           <w:rtl w:val="0"/>
         </w:rPr>
         <w:t xml:space="preserve"> SPLITTING BULK ITEMS</w:t>
+      </w:r>
+      <w:r>
+        <w:rPr>
+          <w:rtl w:val="0"/>
+        </w:rPr>
       </w:r>
     </w:p>
     <w:p>
       <w:pPr>
         <w:numPr>
           <w:ilvl w:val="0"/>
-          <w:numId w:val="8"/>
+          <w:numId w:val="10"/>
         </w:numPr>
         <w:spacing w:line="360" w:lineRule="auto"/>
         <w:ind w:left="720" w:hanging="360"/>
@@ -2035,13 +2196,18 @@
           <w:rtl w:val="0"/>
         </w:rPr>
         <w:t xml:space="preserve"> CALCULATION</w:t>
+      </w:r>
+      <w:r>
+        <w:rPr>
+          <w:rtl w:val="0"/>
+        </w:rPr>
       </w:r>
     </w:p>
     <w:p>
       <w:pPr>
         <w:numPr>
           <w:ilvl w:val="0"/>
-          <w:numId w:val="8"/>
+          <w:numId w:val="10"/>
         </w:numPr>
         <w:spacing w:line="360" w:lineRule="auto"/>
         <w:ind w:left="720" w:hanging="360"/>
@@ -2066,13 +2232,18 @@
           <w:rtl w:val="0"/>
         </w:rPr>
         <w:t xml:space="preserve"> VIEWING IOU’S</w:t>
+      </w:r>
+      <w:r>
+        <w:rPr>
+          <w:rtl w:val="0"/>
+        </w:rPr>
       </w:r>
     </w:p>
     <w:p>
       <w:pPr>
         <w:numPr>
           <w:ilvl w:val="0"/>
-          <w:numId w:val="8"/>
+          <w:numId w:val="10"/>
         </w:numPr>
         <w:spacing w:line="360" w:lineRule="auto"/>
         <w:ind w:left="720" w:hanging="360"/>
@@ -2097,13 +2268,18 @@
           <w:rtl w:val="0"/>
         </w:rPr>
         <w:t xml:space="preserve"> MARKING AS PAID</w:t>
+      </w:r>
+      <w:r>
+        <w:rPr>
+          <w:rtl w:val="0"/>
+        </w:rPr>
       </w:r>
     </w:p>
     <w:p>
       <w:pPr>
         <w:numPr>
           <w:ilvl w:val="0"/>
-          <w:numId w:val="8"/>
+          <w:numId w:val="10"/>
         </w:numPr>
         <w:spacing w:line="360" w:lineRule="auto"/>
         <w:ind w:left="720" w:hanging="360"/>
@@ -2128,6 +2304,11 @@
           <w:rtl w:val="0"/>
         </w:rPr>
         <w:t xml:space="preserve"> VIEWING HISTORY</w:t>
+      </w:r>
+      <w:r>
+        <w:rPr>
+          <w:rtl w:val="0"/>
+        </w:rPr>
       </w:r>
     </w:p>
     <w:tbl>
@@ -2260,7 +2441,7 @@
               <w:rPr>
                 <w:rtl w:val="0"/>
               </w:rPr>
-              <w:t xml:space="preserve">As a roommate, I want to create a household group so that I can manage grocery purchases with the people I live with.</w:t>
+              <w:t xml:space="preserve">As a roommate, I want to create a household group so that I can manage grocery purchases with the people I live with. - Tyler</w:t>
             </w:r>
           </w:p>
         </w:tc>
@@ -2322,7 +2503,7 @@
               <w:rPr>
                 <w:rtl w:val="0"/>
               </w:rPr>
-              <w:t xml:space="preserve">As a roommate, I want to invite other roommates to my household group so that everyone who shares groceries can participate.</w:t>
+              <w:t xml:space="preserve">As a roommate, I want to invite other roommates to my household group so that everyone who shares groceries can participate. - Tyler</w:t>
             </w:r>
           </w:p>
         </w:tc>
@@ -2384,7 +2565,7 @@
               <w:rPr>
                 <w:rtl w:val="0"/>
               </w:rPr>
-              <w:t xml:space="preserve">As a roommate, I want to create a shared grocery list so that everyone can see which items need to be purchased.</w:t>
+              <w:t xml:space="preserve">As a roommate, I want to create a shared grocery list so that everyone can see which items need to be purchased. - Tyler</w:t>
             </w:r>
           </w:p>
         </w:tc>
@@ -2446,7 +2627,7 @@
               <w:rPr>
                 <w:rtl w:val="0"/>
               </w:rPr>
-              <w:t xml:space="preserve">As a roommate, I want to add, edit, and remove items from the grocery list so that the list stays accurate as our needs change.</w:t>
+              <w:t xml:space="preserve">As a roommate, I want to add, edit, and remove items from the grocery list so that the list stays accurate as our needs change. - Tyler</w:t>
             </w:r>
           </w:p>
         </w:tc>
@@ -2502,7 +2683,7 @@
               <w:rPr>
                 <w:rtl w:val="0"/>
               </w:rPr>
-              <w:t xml:space="preserve">As a roommate, I want to organize grocery purchases by shopping trip and store location so that I can see what needs to be bought at what location while grocery shopping.</w:t>
+              <w:t xml:space="preserve">As a roommate, I want to organize grocery purchases by shopping trip and store location so that I can see what needs to be bought at what location while grocery shopping. - Saman</w:t>
             </w:r>
           </w:p>
         </w:tc>
@@ -2558,7 +2739,7 @@
               <w:rPr>
                 <w:rtl w:val="0"/>
               </w:rPr>
-              <w:t xml:space="preserve">As a roommate, I want to record the price and quantity of each purchased item so that the application can calculate how much each roommate owes.</w:t>
+              <w:t xml:space="preserve">As a roommate, I want to record the price and quantity of each purchased item so that the application can calculate how much each roommate owes. - Saman</w:t>
             </w:r>
           </w:p>
         </w:tc>
@@ -2614,7 +2795,7 @@
               <w:rPr>
                 <w:rtl w:val="0"/>
               </w:rPr>
-              <w:t xml:space="preserve">As a roommate, I want to specify which roommates are sharing a grocery item so that people are only charged for items they use.</w:t>
+              <w:t xml:space="preserve">As a roommate, I want to specify which roommates are sharing a grocery item so that people are only charged for items they use. - Saman</w:t>
             </w:r>
           </w:p>
         </w:tc>
@@ -2670,7 +2851,7 @@
               <w:rPr>
                 <w:rtl w:val="0"/>
               </w:rPr>
-              <w:t xml:space="preserve">As a roommate, I want to specify how a bulk grocery item is divided among roommates so that its cost can be split according to the amount each person receives.</w:t>
+              <w:t xml:space="preserve">As a roommate, I want to specify how a bulk grocery item is divided among roommates so that its cost can be split according to the amount each person receives. - Saman</w:t>
             </w:r>
           </w:p>
         </w:tc>
@@ -2726,7 +2907,7 @@
               <w:rPr>
                 <w:rtl w:val="0"/>
               </w:rPr>
-              <w:t xml:space="preserve">As a roommate, I want the application to automatically calculate each person's share of a grocery purchase so that we do not have to calculate the costs manually.</w:t>
+              <w:t xml:space="preserve">As a roommate, I want the application to automatically calculate each person's share of a grocery purchase so that we do not have to calculate the costs manually. - Yusha</w:t>
             </w:r>
           </w:p>
         </w:tc>
@@ -2782,7 +2963,7 @@
               <w:rPr>
                 <w:rtl w:val="0"/>
               </w:rPr>
-              <w:t xml:space="preserve">As a roommate, I want to see how much I currently owe each roommate so that I know what payments I need to make.</w:t>
+              <w:t xml:space="preserve">As a roommate, I want to see how much I currently owe each roommate so that I know what payments I need to make. - Yusha</w:t>
             </w:r>
           </w:p>
         </w:tc>
@@ -2838,7 +3019,7 @@
               <w:rPr>
                 <w:rtl w:val="0"/>
               </w:rPr>
-              <w:t xml:space="preserve">As a roommate, I want to mark an amount I owe as paid so that our shared balances remain up to date.</w:t>
+              <w:t xml:space="preserve">As a roommate, I want to mark an amount I owe as paid so that our shared balances remain up to date. - Yusha</w:t>
             </w:r>
           </w:p>
         </w:tc>
@@ -2894,7 +3075,7 @@
               <w:rPr>
                 <w:rtl w:val="0"/>
               </w:rPr>
-              <w:t xml:space="preserve">As a roommate, I want to view a history of previous grocery purchases and cost splits so that I can review how shared grocery expenses were calculated.</w:t>
+              <w:t xml:space="preserve">As a roommate, I want to view a history of previous grocery purchases and cost splits so that I can review how shared grocery expenses were calculated. - Yusha</w:t>
             </w:r>
           </w:p>
         </w:tc>
@@ -2939,7 +3120,7 @@
         <w:widowControl w:val="0"/>
         <w:numPr>
           <w:ilvl w:val="0"/>
-          <w:numId w:val="3"/>
+          <w:numId w:val="5"/>
         </w:numPr>
         <w:pBdr>
           <w:top w:space="0" w:sz="0" w:val="nil"/>
@@ -2985,6 +3166,11 @@
           <w:rtl w:val="0"/>
         </w:rPr>
         <w:t xml:space="preserve">FUNCTIONAL REQUIREMENTS</w:t>
+      </w:r>
+      <w:r>
+        <w:rPr>
+          <w:rtl w:val="0"/>
+        </w:rPr>
       </w:r>
     </w:p>
     <w:p>
@@ -3386,7 +3572,7 @@
       <w:pPr>
         <w:numPr>
           <w:ilvl w:val="0"/>
-          <w:numId w:val="9"/>
+          <w:numId w:val="11"/>
         </w:numPr>
         <w:spacing w:line="360" w:lineRule="auto"/>
         <w:ind w:left="720" w:hanging="360"/>
@@ -3411,13 +3597,18 @@
           <w:rtl w:val="0"/>
         </w:rPr>
         <w:t xml:space="preserve"> HANDLING ERRORS AND BAD DATA</w:t>
+      </w:r>
+      <w:r>
+        <w:rPr>
+          <w:rtl w:val="0"/>
+        </w:rPr>
       </w:r>
     </w:p>
     <w:p>
       <w:pPr>
         <w:numPr>
           <w:ilvl w:val="0"/>
-          <w:numId w:val="9"/>
+          <w:numId w:val="11"/>
         </w:numPr>
         <w:spacing w:line="360" w:lineRule="auto"/>
         <w:ind w:left="720" w:hanging="360"/>
@@ -3442,13 +3633,18 @@
           <w:rtl w:val="0"/>
         </w:rPr>
         <w:t xml:space="preserve"> IMPLEMENT BCRYPT FOR PASSWORD HASHING AND ENVIRONMENT VARIABLES FOR DB CREDENTIALS.</w:t>
+      </w:r>
+      <w:r>
+        <w:rPr>
+          <w:rtl w:val="0"/>
+        </w:rPr>
       </w:r>
     </w:p>
     <w:p>
       <w:pPr>
         <w:numPr>
           <w:ilvl w:val="0"/>
-          <w:numId w:val="9"/>
+          <w:numId w:val="11"/>
         </w:numPr>
         <w:spacing w:line="360" w:lineRule="auto"/>
         <w:ind w:left="720" w:hanging="360"/>
@@ -3473,6 +3669,11 @@
           <w:rtl w:val="0"/>
         </w:rPr>
         <w:t xml:space="preserve">: </w:t>
+      </w:r>
+      <w:r>
+        <w:rPr>
+          <w:rtl w:val="0"/>
+        </w:rPr>
       </w:r>
     </w:p>
     <w:p>
@@ -3500,7 +3701,7 @@
       <w:pPr>
         <w:numPr>
           <w:ilvl w:val="0"/>
-          <w:numId w:val="10"/>
+          <w:numId w:val="2"/>
         </w:numPr>
         <w:spacing w:line="360" w:lineRule="auto"/>
         <w:ind w:left="720" w:hanging="360"/>
@@ -3525,13 +3726,18 @@
           <w:rtl w:val="0"/>
         </w:rPr>
         <w:t xml:space="preserve"> (LIST METHOD | URL | DESCRIPTION)</w:t>
+      </w:r>
+      <w:r>
+        <w:rPr>
+          <w:rtl w:val="0"/>
+        </w:rPr>
       </w:r>
     </w:p>
     <w:p>
       <w:pPr>
         <w:numPr>
           <w:ilvl w:val="0"/>
-          <w:numId w:val="9"/>
+          <w:numId w:val="11"/>
         </w:numPr>
         <w:spacing w:line="360" w:lineRule="auto"/>
         <w:ind w:left="720" w:hanging="360"/>
@@ -3550,13 +3756,18 @@
           <w:rtl w:val="0"/>
         </w:rPr>
         <w:t xml:space="preserve">LIST YOUR PLANNED ENDPOINTS BASED ON YOUR REST SLIDE:</w:t>
+      </w:r>
+      <w:r>
+        <w:rPr>
+          <w:rtl w:val="0"/>
+        </w:rPr>
       </w:r>
     </w:p>
     <w:p>
       <w:pPr>
         <w:numPr>
           <w:ilvl w:val="1"/>
-          <w:numId w:val="9"/>
+          <w:numId w:val="11"/>
         </w:numPr>
         <w:spacing w:line="360" w:lineRule="auto"/>
         <w:ind w:left="1440" w:hanging="360"/>
@@ -3575,13 +3786,18 @@
           <w:rtl w:val="0"/>
         </w:rPr>
         <w:t xml:space="preserve">GET /API/RESOURCES — FETCHES COLLECTION.</w:t>
+      </w:r>
+      <w:r>
+        <w:rPr>
+          <w:rtl w:val="0"/>
+        </w:rPr>
       </w:r>
     </w:p>
     <w:p>
       <w:pPr>
         <w:numPr>
           <w:ilvl w:val="1"/>
-          <w:numId w:val="9"/>
+          <w:numId w:val="11"/>
         </w:numPr>
         <w:spacing w:line="360" w:lineRule="auto"/>
         <w:ind w:left="1440" w:hanging="360"/>
@@ -3600,13 +3816,18 @@
           <w:rtl w:val="0"/>
         </w:rPr>
         <w:t xml:space="preserve">POST /API/RESOURCES — CREATES A NEW RESOURCE.</w:t>
+      </w:r>
+      <w:r>
+        <w:rPr>
+          <w:rtl w:val="0"/>
+        </w:rPr>
       </w:r>
     </w:p>
     <w:p>
       <w:pPr>
         <w:numPr>
           <w:ilvl w:val="0"/>
-          <w:numId w:val="10"/>
+          <w:numId w:val="2"/>
         </w:numPr>
         <w:spacing w:line="360" w:lineRule="auto"/>
         <w:ind w:left="720" w:hanging="360"/>
@@ -3631,6 +3852,11 @@
           <w:rtl w:val="0"/>
         </w:rPr>
         <w:t xml:space="preserve"> (ATTACH A DIAGRAM) </w:t>
+      </w:r>
+      <w:r>
+        <w:rPr>
+          <w:rtl w:val="0"/>
+        </w:rPr>
       </w:r>
     </w:p>
     <w:p>
@@ -3667,7 +3893,7 @@
         <w:widowControl w:val="0"/>
         <w:numPr>
           <w:ilvl w:val="0"/>
-          <w:numId w:val="2"/>
+          <w:numId w:val="4"/>
         </w:numPr>
         <w:pBdr>
           <w:top w:space="0" w:sz="0" w:val="nil"/>
@@ -3714,12 +3940,17 @@
         </w:rPr>
         <w:t xml:space="preserve">USER INTERFACE (UI) </w:t>
       </w:r>
+      <w:r>
+        <w:rPr>
+          <w:rtl w:val="0"/>
+        </w:rPr>
+      </w:r>
     </w:p>
     <w:p>
       <w:pPr>
         <w:numPr>
           <w:ilvl w:val="1"/>
-          <w:numId w:val="2"/>
+          <w:numId w:val="4"/>
         </w:numPr>
         <w:spacing w:line="360" w:lineRule="auto"/>
         <w:ind w:left="1440" w:hanging="360"/>
@@ -3738,6 +3969,11 @@
           <w:rtl w:val="0"/>
         </w:rPr>
         <w:t xml:space="preserve">5.1 WIREFRAMES / MOCKUPS</w:t>
+      </w:r>
+      <w:r>
+        <w:rPr>
+          <w:rtl w:val="0"/>
+        </w:rPr>
       </w:r>
     </w:p>
     <w:p>
@@ -3748,7 +3984,7 @@
         <w:widowControl w:val="0"/>
         <w:numPr>
           <w:ilvl w:val="0"/>
-          <w:numId w:val="2"/>
+          <w:numId w:val="4"/>
         </w:numPr>
         <w:pBdr>
           <w:top w:space="0" w:sz="0" w:val="nil"/>
@@ -3794,6 +4030,11 @@
           <w:rtl w:val="0"/>
         </w:rPr>
         <w:t xml:space="preserve">DATA REQUIREMENTS</w:t>
+      </w:r>
+      <w:r>
+        <w:rPr>
+          <w:rtl w:val="0"/>
+        </w:rPr>
       </w:r>
     </w:p>
     <w:p>
@@ -3843,7 +4084,7 @@
         <w:widowControl w:val="0"/>
         <w:numPr>
           <w:ilvl w:val="0"/>
-          <w:numId w:val="2"/>
+          <w:numId w:val="4"/>
         </w:numPr>
         <w:pBdr>
           <w:top w:space="0" w:sz="0" w:val="nil"/>
@@ -3889,6 +4130,11 @@
           <w:rtl w:val="0"/>
         </w:rPr>
         <w:t xml:space="preserve">TRACEABILITY MATRIX </w:t>
+      </w:r>
+      <w:r>
+        <w:rPr>
+          <w:rtl w:val="0"/>
+        </w:rPr>
       </w:r>
     </w:p>
     <w:p>
@@ -4315,7 +4561,7 @@
         <w:widowControl w:val="0"/>
         <w:numPr>
           <w:ilvl w:val="0"/>
-          <w:numId w:val="2"/>
+          <w:numId w:val="4"/>
         </w:numPr>
         <w:pBdr>
           <w:top w:space="0" w:sz="0" w:val="nil"/>
@@ -4362,12 +4608,17 @@
         </w:rPr>
         <w:t xml:space="preserve">AI USAGE &amp; DISCLOSURE (MANDATORY)</w:t>
       </w:r>
+      <w:r>
+        <w:rPr>
+          <w:rtl w:val="0"/>
+        </w:rPr>
+      </w:r>
     </w:p>
     <w:p>
       <w:pPr>
         <w:numPr>
           <w:ilvl w:val="0"/>
-          <w:numId w:val="11"/>
+          <w:numId w:val="3"/>
         </w:numPr>
         <w:ind w:left="720" w:hanging="360"/>
         <w:rPr>
@@ -4392,12 +4643,17 @@
         </w:rPr>
         <w:t xml:space="preserve"> [E.G., CLAUDE 3.5, GPT-4O]</w:t>
       </w:r>
+      <w:r>
+        <w:rPr>
+          <w:rtl w:val="0"/>
+        </w:rPr>
+      </w:r>
     </w:p>
     <w:p>
       <w:pPr>
         <w:numPr>
           <w:ilvl w:val="0"/>
-          <w:numId w:val="11"/>
+          <w:numId w:val="3"/>
         </w:numPr>
         <w:ind w:left="720" w:hanging="360"/>
         <w:rPr>
@@ -4559,219 +4815,12 @@
   </w:abstractNum>
   <w:abstractNum w:abstractNumId="2">
     <w:lvl w:ilvl="0">
-      <w:start w:val="5"/>
-      <w:numFmt w:val="decimal"/>
-      <w:lvlText w:val="%1."/>
-      <w:lvlJc w:val="left"/>
-      <w:pPr>
-        <w:ind w:left="360" w:hanging="360"/>
-      </w:pPr>
-      <w:rPr/>
-    </w:lvl>
-    <w:lvl w:ilvl="1">
-      <w:start w:val="1"/>
-      <w:numFmt w:val="lowerLetter"/>
-      <w:lvlText w:val="%2."/>
-      <w:lvlJc w:val="left"/>
-      <w:pPr>
-        <w:ind w:left="1440" w:hanging="360"/>
-      </w:pPr>
-      <w:rPr/>
-    </w:lvl>
-    <w:lvl w:ilvl="2">
-      <w:start w:val="1"/>
-      <w:numFmt w:val="lowerRoman"/>
-      <w:lvlText w:val="%3."/>
-      <w:lvlJc w:val="right"/>
-      <w:pPr>
-        <w:ind w:left="2160" w:hanging="180"/>
-      </w:pPr>
-      <w:rPr/>
-    </w:lvl>
-    <w:lvl w:ilvl="3">
-      <w:start w:val="1"/>
-      <w:numFmt w:val="decimal"/>
-      <w:lvlText w:val="%4."/>
-      <w:lvlJc w:val="left"/>
-      <w:pPr>
-        <w:ind w:left="2880" w:hanging="360"/>
-      </w:pPr>
-      <w:rPr/>
-    </w:lvl>
-    <w:lvl w:ilvl="4">
-      <w:start w:val="1"/>
-      <w:numFmt w:val="lowerLetter"/>
-      <w:lvlText w:val="%5."/>
-      <w:lvlJc w:val="left"/>
-      <w:pPr>
-        <w:ind w:left="3600" w:hanging="360"/>
-      </w:pPr>
-      <w:rPr/>
-    </w:lvl>
-    <w:lvl w:ilvl="5">
-      <w:start w:val="1"/>
-      <w:numFmt w:val="lowerRoman"/>
-      <w:lvlText w:val="%6."/>
-      <w:lvlJc w:val="right"/>
-      <w:pPr>
-        <w:ind w:left="4320" w:hanging="180"/>
-      </w:pPr>
-      <w:rPr/>
-    </w:lvl>
-    <w:lvl w:ilvl="6">
-      <w:start w:val="1"/>
-      <w:numFmt w:val="decimal"/>
-      <w:lvlText w:val="%7."/>
-      <w:lvlJc w:val="left"/>
-      <w:pPr>
-        <w:ind w:left="5040" w:hanging="360"/>
-      </w:pPr>
-      <w:rPr/>
-    </w:lvl>
-    <w:lvl w:ilvl="7">
-      <w:start w:val="1"/>
-      <w:numFmt w:val="lowerLetter"/>
-      <w:lvlText w:val="%8."/>
-      <w:lvlJc w:val="left"/>
-      <w:pPr>
-        <w:ind w:left="5760" w:hanging="360"/>
-      </w:pPr>
-      <w:rPr/>
-    </w:lvl>
-    <w:lvl w:ilvl="8">
-      <w:start w:val="1"/>
-      <w:numFmt w:val="lowerRoman"/>
-      <w:lvlText w:val="%9."/>
-      <w:lvlJc w:val="right"/>
-      <w:pPr>
-        <w:ind w:left="6480" w:hanging="180"/>
-      </w:pPr>
-      <w:rPr/>
-    </w:lvl>
-  </w:abstractNum>
-  <w:abstractNum w:abstractNumId="3">
-    <w:lvl w:ilvl="0">
-      <w:start w:val="3"/>
-      <w:numFmt w:val="decimal"/>
-      <w:lvlText w:val="%1."/>
-      <w:lvlJc w:val="left"/>
-      <w:pPr>
-        <w:ind w:left="360" w:hanging="360"/>
-      </w:pPr>
-      <w:rPr/>
-    </w:lvl>
-    <w:lvl w:ilvl="1">
-      <w:start w:val="1"/>
-      <w:numFmt w:val="lowerLetter"/>
-      <w:lvlText w:val="%2."/>
-      <w:lvlJc w:val="left"/>
-      <w:pPr>
-        <w:ind w:left="1440" w:hanging="360"/>
-      </w:pPr>
-      <w:rPr/>
-    </w:lvl>
-    <w:lvl w:ilvl="2">
-      <w:start w:val="1"/>
-      <w:numFmt w:val="lowerRoman"/>
-      <w:lvlText w:val="%3."/>
-      <w:lvlJc w:val="right"/>
-      <w:pPr>
-        <w:ind w:left="2160" w:hanging="180"/>
-      </w:pPr>
-      <w:rPr/>
-    </w:lvl>
-    <w:lvl w:ilvl="3">
-      <w:start w:val="1"/>
-      <w:numFmt w:val="decimal"/>
-      <w:lvlText w:val="%4."/>
-      <w:lvlJc w:val="left"/>
-      <w:pPr>
-        <w:ind w:left="2880" w:hanging="360"/>
-      </w:pPr>
-      <w:rPr/>
-    </w:lvl>
-    <w:lvl w:ilvl="4">
-      <w:start w:val="1"/>
-      <w:numFmt w:val="lowerLetter"/>
-      <w:lvlText w:val="%5."/>
-      <w:lvlJc w:val="left"/>
-      <w:pPr>
-        <w:ind w:left="3600" w:hanging="360"/>
-      </w:pPr>
-      <w:rPr/>
-    </w:lvl>
-    <w:lvl w:ilvl="5">
-      <w:start w:val="1"/>
-      <w:numFmt w:val="lowerRoman"/>
-      <w:lvlText w:val="%6."/>
-      <w:lvlJc w:val="right"/>
-      <w:pPr>
-        <w:ind w:left="4320" w:hanging="180"/>
-      </w:pPr>
-      <w:rPr/>
-    </w:lvl>
-    <w:lvl w:ilvl="6">
-      <w:start w:val="1"/>
-      <w:numFmt w:val="decimal"/>
-      <w:lvlText w:val="%7."/>
-      <w:lvlJc w:val="left"/>
-      <w:pPr>
-        <w:ind w:left="5040" w:hanging="360"/>
-      </w:pPr>
-      <w:rPr/>
-    </w:lvl>
-    <w:lvl w:ilvl="7">
-      <w:start w:val="1"/>
-      <w:numFmt w:val="lowerLetter"/>
-      <w:lvlText w:val="%8."/>
-      <w:lvlJc w:val="left"/>
-      <w:pPr>
-        <w:ind w:left="5760" w:hanging="360"/>
-      </w:pPr>
-      <w:rPr/>
-    </w:lvl>
-    <w:lvl w:ilvl="8">
-      <w:start w:val="1"/>
-      <w:numFmt w:val="lowerRoman"/>
-      <w:lvlText w:val="%9."/>
-      <w:lvlJc w:val="right"/>
-      <w:pPr>
-        <w:ind w:left="6480" w:hanging="180"/>
-      </w:pPr>
-      <w:rPr/>
-    </w:lvl>
-  </w:abstractNum>
-  <w:abstractNum w:abstractNumId="4">
-    <w:lvl w:ilvl="0">
-      <w:start w:val="1"/>
-      <w:numFmt w:val="decimal"/>
-      <w:lvlText w:val="%1."/>
+      <w:start w:val="1"/>
+      <w:numFmt w:val="bullet"/>
+      <w:lvlText w:val="●"/>
       <w:lvlJc w:val="left"/>
       <w:pPr>
         <w:ind w:left="720" w:hanging="360"/>
-      </w:pPr>
-      <w:rPr>
-        <w:sz w:val="20"/>
-        <w:szCs w:val="20"/>
-      </w:rPr>
-    </w:lvl>
-    <w:lvl w:ilvl="1">
-      <w:start w:val="1"/>
-      <w:numFmt w:val="decimal"/>
-      <w:lvlText w:val="%2."/>
-      <w:lvlJc w:val="left"/>
-      <w:pPr>
-        <w:ind w:left="1440" w:hanging="360"/>
-      </w:pPr>
-      <w:rPr/>
-    </w:lvl>
-    <w:lvl w:ilvl="2">
-      <w:start w:val="1"/>
-      <w:numFmt w:val="bullet"/>
-      <w:lvlText w:val="▪"/>
-      <w:lvlJc w:val="left"/>
-      <w:pPr>
-        <w:ind w:left="2160" w:hanging="360"/>
       </w:pPr>
       <w:rPr>
         <w:rFonts w:ascii="Noto Sans Symbols" w:cs="Noto Sans Symbols" w:eastAsia="Noto Sans Symbols" w:hAnsi="Noto Sans Symbols"/>
@@ -4779,13 +4828,27 @@
         <w:szCs w:val="20"/>
       </w:rPr>
     </w:lvl>
-    <w:lvl w:ilvl="3">
+    <w:lvl w:ilvl="1">
+      <w:start w:val="1"/>
+      <w:numFmt w:val="bullet"/>
+      <w:lvlText w:val="o"/>
+      <w:lvlJc w:val="left"/>
+      <w:pPr>
+        <w:ind w:left="1440" w:hanging="360"/>
+      </w:pPr>
+      <w:rPr>
+        <w:rFonts w:ascii="Courier New" w:cs="Courier New" w:eastAsia="Courier New" w:hAnsi="Courier New"/>
+        <w:sz w:val="20"/>
+        <w:szCs w:val="20"/>
+      </w:rPr>
+    </w:lvl>
+    <w:lvl w:ilvl="2">
       <w:start w:val="1"/>
       <w:numFmt w:val="bullet"/>
       <w:lvlText w:val="▪"/>
       <w:lvlJc w:val="left"/>
       <w:pPr>
-        <w:ind w:left="2880" w:hanging="360"/>
+        <w:ind w:left="2160" w:hanging="360"/>
       </w:pPr>
       <w:rPr>
         <w:rFonts w:ascii="Noto Sans Symbols" w:cs="Noto Sans Symbols" w:eastAsia="Noto Sans Symbols" w:hAnsi="Noto Sans Symbols"/>
@@ -4793,13 +4856,13 @@
         <w:szCs w:val="20"/>
       </w:rPr>
     </w:lvl>
-    <w:lvl w:ilvl="4">
+    <w:lvl w:ilvl="3">
       <w:start w:val="1"/>
       <w:numFmt w:val="bullet"/>
       <w:lvlText w:val="▪"/>
       <w:lvlJc w:val="left"/>
       <w:pPr>
-        <w:ind w:left="3600" w:hanging="360"/>
+        <w:ind w:left="2880" w:hanging="360"/>
       </w:pPr>
       <w:rPr>
         <w:rFonts w:ascii="Noto Sans Symbols" w:cs="Noto Sans Symbols" w:eastAsia="Noto Sans Symbols" w:hAnsi="Noto Sans Symbols"/>
@@ -4807,13 +4870,13 @@
         <w:szCs w:val="20"/>
       </w:rPr>
     </w:lvl>
-    <w:lvl w:ilvl="5">
+    <w:lvl w:ilvl="4">
       <w:start w:val="1"/>
       <w:numFmt w:val="bullet"/>
       <w:lvlText w:val="▪"/>
       <w:lvlJc w:val="left"/>
       <w:pPr>
-        <w:ind w:left="4320" w:hanging="360"/>
+        <w:ind w:left="3600" w:hanging="360"/>
       </w:pPr>
       <w:rPr>
         <w:rFonts w:ascii="Noto Sans Symbols" w:cs="Noto Sans Symbols" w:eastAsia="Noto Sans Symbols" w:hAnsi="Noto Sans Symbols"/>
@@ -4821,13 +4884,13 @@
         <w:szCs w:val="20"/>
       </w:rPr>
     </w:lvl>
-    <w:lvl w:ilvl="6">
+    <w:lvl w:ilvl="5">
       <w:start w:val="1"/>
       <w:numFmt w:val="bullet"/>
       <w:lvlText w:val="▪"/>
       <w:lvlJc w:val="left"/>
       <w:pPr>
-        <w:ind w:left="5040" w:hanging="360"/>
+        <w:ind w:left="4320" w:hanging="360"/>
       </w:pPr>
       <w:rPr>
         <w:rFonts w:ascii="Noto Sans Symbols" w:cs="Noto Sans Symbols" w:eastAsia="Noto Sans Symbols" w:hAnsi="Noto Sans Symbols"/>
@@ -4835,13 +4898,13 @@
         <w:szCs w:val="20"/>
       </w:rPr>
     </w:lvl>
-    <w:lvl w:ilvl="7">
+    <w:lvl w:ilvl="6">
       <w:start w:val="1"/>
       <w:numFmt w:val="bullet"/>
       <w:lvlText w:val="▪"/>
       <w:lvlJc w:val="left"/>
       <w:pPr>
-        <w:ind w:left="5760" w:hanging="360"/>
+        <w:ind w:left="5040" w:hanging="360"/>
       </w:pPr>
       <w:rPr>
         <w:rFonts w:ascii="Noto Sans Symbols" w:cs="Noto Sans Symbols" w:eastAsia="Noto Sans Symbols" w:hAnsi="Noto Sans Symbols"/>
@@ -4849,13 +4912,13 @@
         <w:szCs w:val="20"/>
       </w:rPr>
     </w:lvl>
-    <w:lvl w:ilvl="8">
+    <w:lvl w:ilvl="7">
       <w:start w:val="1"/>
       <w:numFmt w:val="bullet"/>
       <w:lvlText w:val="▪"/>
       <w:lvlJc w:val="left"/>
       <w:pPr>
-        <w:ind w:left="6480" w:hanging="360"/>
+        <w:ind w:left="5760" w:hanging="360"/>
       </w:pPr>
       <w:rPr>
         <w:rFonts w:ascii="Noto Sans Symbols" w:cs="Noto Sans Symbols" w:eastAsia="Noto Sans Symbols" w:hAnsi="Noto Sans Symbols"/>
@@ -4863,107 +4926,13 @@
         <w:szCs w:val="20"/>
       </w:rPr>
     </w:lvl>
-  </w:abstractNum>
-  <w:abstractNum w:abstractNumId="5">
-    <w:lvl w:ilvl="0">
-      <w:start w:val="1"/>
-      <w:numFmt w:val="decimal"/>
-      <w:lvlText w:val="%1."/>
-      <w:lvlJc w:val="left"/>
-      <w:pPr>
-        <w:ind w:left="360" w:hanging="360"/>
-      </w:pPr>
-      <w:rPr/>
-    </w:lvl>
-    <w:lvl w:ilvl="1">
-      <w:start w:val="1"/>
-      <w:numFmt w:val="lowerLetter"/>
-      <w:lvlText w:val="%2."/>
-      <w:lvlJc w:val="left"/>
-      <w:pPr>
-        <w:ind w:left="1440" w:hanging="360"/>
-      </w:pPr>
-      <w:rPr/>
-    </w:lvl>
-    <w:lvl w:ilvl="2">
-      <w:start w:val="1"/>
-      <w:numFmt w:val="lowerRoman"/>
-      <w:lvlText w:val="%3."/>
-      <w:lvlJc w:val="right"/>
-      <w:pPr>
-        <w:ind w:left="2160" w:hanging="180"/>
-      </w:pPr>
-      <w:rPr/>
-    </w:lvl>
-    <w:lvl w:ilvl="3">
-      <w:start w:val="1"/>
-      <w:numFmt w:val="decimal"/>
-      <w:lvlText w:val="%4."/>
-      <w:lvlJc w:val="left"/>
-      <w:pPr>
-        <w:ind w:left="2880" w:hanging="360"/>
-      </w:pPr>
-      <w:rPr/>
-    </w:lvl>
-    <w:lvl w:ilvl="4">
-      <w:start w:val="1"/>
-      <w:numFmt w:val="lowerLetter"/>
-      <w:lvlText w:val="%5."/>
-      <w:lvlJc w:val="left"/>
-      <w:pPr>
-        <w:ind w:left="3600" w:hanging="360"/>
-      </w:pPr>
-      <w:rPr/>
-    </w:lvl>
-    <w:lvl w:ilvl="5">
-      <w:start w:val="1"/>
-      <w:numFmt w:val="lowerRoman"/>
-      <w:lvlText w:val="%6."/>
-      <w:lvlJc w:val="right"/>
-      <w:pPr>
-        <w:ind w:left="4320" w:hanging="180"/>
-      </w:pPr>
-      <w:rPr/>
-    </w:lvl>
-    <w:lvl w:ilvl="6">
-      <w:start w:val="1"/>
-      <w:numFmt w:val="decimal"/>
-      <w:lvlText w:val="%7."/>
-      <w:lvlJc w:val="left"/>
-      <w:pPr>
-        <w:ind w:left="5040" w:hanging="360"/>
-      </w:pPr>
-      <w:rPr/>
-    </w:lvl>
-    <w:lvl w:ilvl="7">
-      <w:start w:val="1"/>
-      <w:numFmt w:val="lowerLetter"/>
-      <w:lvlText w:val="%8."/>
-      <w:lvlJc w:val="left"/>
-      <w:pPr>
-        <w:ind w:left="5760" w:hanging="360"/>
-      </w:pPr>
-      <w:rPr/>
-    </w:lvl>
     <w:lvl w:ilvl="8">
       <w:start w:val="1"/>
-      <w:numFmt w:val="lowerRoman"/>
-      <w:lvlText w:val="%9."/>
-      <w:lvlJc w:val="right"/>
-      <w:pPr>
-        <w:ind w:left="6480" w:hanging="180"/>
-      </w:pPr>
-      <w:rPr/>
-    </w:lvl>
-  </w:abstractNum>
-  <w:abstractNum w:abstractNumId="6">
-    <w:lvl w:ilvl="0">
-      <w:start w:val="1"/>
       <w:numFmt w:val="bullet"/>
-      <w:lvlText w:val="●"/>
-      <w:lvlJc w:val="left"/>
-      <w:pPr>
-        <w:ind w:left="720" w:hanging="360"/>
+      <w:lvlText w:val="▪"/>
+      <w:lvlJc w:val="left"/>
+      <w:pPr>
+        <w:ind w:left="6480" w:hanging="360"/>
       </w:pPr>
       <w:rPr>
         <w:rFonts w:ascii="Noto Sans Symbols" w:cs="Noto Sans Symbols" w:eastAsia="Noto Sans Symbols" w:hAnsi="Noto Sans Symbols"/>
@@ -4971,6 +4940,22 @@
         <w:szCs w:val="20"/>
       </w:rPr>
     </w:lvl>
+  </w:abstractNum>
+  <w:abstractNum w:abstractNumId="3">
+    <w:lvl w:ilvl="0">
+      <w:start w:val="1"/>
+      <w:numFmt w:val="bullet"/>
+      <w:lvlText w:val="●"/>
+      <w:lvlJc w:val="left"/>
+      <w:pPr>
+        <w:ind w:left="720" w:hanging="360"/>
+      </w:pPr>
+      <w:rPr>
+        <w:rFonts w:ascii="Noto Sans Symbols" w:cs="Noto Sans Symbols" w:eastAsia="Noto Sans Symbols" w:hAnsi="Noto Sans Symbols"/>
+        <w:sz w:val="20"/>
+        <w:szCs w:val="20"/>
+      </w:rPr>
+    </w:lvl>
     <w:lvl w:ilvl="1">
       <w:start w:val="1"/>
       <w:numFmt w:val="bullet"/>
@@ -5084,14 +5069,221 @@
       </w:rPr>
     </w:lvl>
   </w:abstractNum>
-  <w:abstractNum w:abstractNumId="7">
+  <w:abstractNum w:abstractNumId="4">
     <w:lvl w:ilvl="0">
+      <w:start w:val="5"/>
+      <w:numFmt w:val="decimal"/>
+      <w:lvlText w:val="%1."/>
+      <w:lvlJc w:val="left"/>
+      <w:pPr>
+        <w:ind w:left="360" w:hanging="360"/>
+      </w:pPr>
+      <w:rPr/>
+    </w:lvl>
+    <w:lvl w:ilvl="1">
+      <w:start w:val="1"/>
+      <w:numFmt w:val="lowerLetter"/>
+      <w:lvlText w:val="%2."/>
+      <w:lvlJc w:val="left"/>
+      <w:pPr>
+        <w:ind w:left="1440" w:hanging="360"/>
+      </w:pPr>
+      <w:rPr/>
+    </w:lvl>
+    <w:lvl w:ilvl="2">
+      <w:start w:val="1"/>
+      <w:numFmt w:val="lowerRoman"/>
+      <w:lvlText w:val="%3."/>
+      <w:lvlJc w:val="right"/>
+      <w:pPr>
+        <w:ind w:left="2160" w:hanging="180"/>
+      </w:pPr>
+      <w:rPr/>
+    </w:lvl>
+    <w:lvl w:ilvl="3">
+      <w:start w:val="1"/>
+      <w:numFmt w:val="decimal"/>
+      <w:lvlText w:val="%4."/>
+      <w:lvlJc w:val="left"/>
+      <w:pPr>
+        <w:ind w:left="2880" w:hanging="360"/>
+      </w:pPr>
+      <w:rPr/>
+    </w:lvl>
+    <w:lvl w:ilvl="4">
+      <w:start w:val="1"/>
+      <w:numFmt w:val="lowerLetter"/>
+      <w:lvlText w:val="%5."/>
+      <w:lvlJc w:val="left"/>
+      <w:pPr>
+        <w:ind w:left="3600" w:hanging="360"/>
+      </w:pPr>
+      <w:rPr/>
+    </w:lvl>
+    <w:lvl w:ilvl="5">
+      <w:start w:val="1"/>
+      <w:numFmt w:val="lowerRoman"/>
+      <w:lvlText w:val="%6."/>
+      <w:lvlJc w:val="right"/>
+      <w:pPr>
+        <w:ind w:left="4320" w:hanging="180"/>
+      </w:pPr>
+      <w:rPr/>
+    </w:lvl>
+    <w:lvl w:ilvl="6">
+      <w:start w:val="1"/>
+      <w:numFmt w:val="decimal"/>
+      <w:lvlText w:val="%7."/>
+      <w:lvlJc w:val="left"/>
+      <w:pPr>
+        <w:ind w:left="5040" w:hanging="360"/>
+      </w:pPr>
+      <w:rPr/>
+    </w:lvl>
+    <w:lvl w:ilvl="7">
+      <w:start w:val="1"/>
+      <w:numFmt w:val="lowerLetter"/>
+      <w:lvlText w:val="%8."/>
+      <w:lvlJc w:val="left"/>
+      <w:pPr>
+        <w:ind w:left="5760" w:hanging="360"/>
+      </w:pPr>
+      <w:rPr/>
+    </w:lvl>
+    <w:lvl w:ilvl="8">
+      <w:start w:val="1"/>
+      <w:numFmt w:val="lowerRoman"/>
+      <w:lvlText w:val="%9."/>
+      <w:lvlJc w:val="right"/>
+      <w:pPr>
+        <w:ind w:left="6480" w:hanging="180"/>
+      </w:pPr>
+      <w:rPr/>
+    </w:lvl>
+  </w:abstractNum>
+  <w:abstractNum w:abstractNumId="5">
+    <w:lvl w:ilvl="0">
+      <w:start w:val="3"/>
+      <w:numFmt w:val="decimal"/>
+      <w:lvlText w:val="%1."/>
+      <w:lvlJc w:val="left"/>
+      <w:pPr>
+        <w:ind w:left="360" w:hanging="360"/>
+      </w:pPr>
+      <w:rPr/>
+    </w:lvl>
+    <w:lvl w:ilvl="1">
+      <w:start w:val="1"/>
+      <w:numFmt w:val="lowerLetter"/>
+      <w:lvlText w:val="%2."/>
+      <w:lvlJc w:val="left"/>
+      <w:pPr>
+        <w:ind w:left="1440" w:hanging="360"/>
+      </w:pPr>
+      <w:rPr/>
+    </w:lvl>
+    <w:lvl w:ilvl="2">
+      <w:start w:val="1"/>
+      <w:numFmt w:val="lowerRoman"/>
+      <w:lvlText w:val="%3."/>
+      <w:lvlJc w:val="right"/>
+      <w:pPr>
+        <w:ind w:left="2160" w:hanging="180"/>
+      </w:pPr>
+      <w:rPr/>
+    </w:lvl>
+    <w:lvl w:ilvl="3">
+      <w:start w:val="1"/>
+      <w:numFmt w:val="decimal"/>
+      <w:lvlText w:val="%4."/>
+      <w:lvlJc w:val="left"/>
+      <w:pPr>
+        <w:ind w:left="2880" w:hanging="360"/>
+      </w:pPr>
+      <w:rPr/>
+    </w:lvl>
+    <w:lvl w:ilvl="4">
+      <w:start w:val="1"/>
+      <w:numFmt w:val="lowerLetter"/>
+      <w:lvlText w:val="%5."/>
+      <w:lvlJc w:val="left"/>
+      <w:pPr>
+        <w:ind w:left="3600" w:hanging="360"/>
+      </w:pPr>
+      <w:rPr/>
+    </w:lvl>
+    <w:lvl w:ilvl="5">
+      <w:start w:val="1"/>
+      <w:numFmt w:val="lowerRoman"/>
+      <w:lvlText w:val="%6."/>
+      <w:lvlJc w:val="right"/>
+      <w:pPr>
+        <w:ind w:left="4320" w:hanging="180"/>
+      </w:pPr>
+      <w:rPr/>
+    </w:lvl>
+    <w:lvl w:ilvl="6">
+      <w:start w:val="1"/>
+      <w:numFmt w:val="decimal"/>
+      <w:lvlText w:val="%7."/>
+      <w:lvlJc w:val="left"/>
+      <w:pPr>
+        <w:ind w:left="5040" w:hanging="360"/>
+      </w:pPr>
+      <w:rPr/>
+    </w:lvl>
+    <w:lvl w:ilvl="7">
+      <w:start w:val="1"/>
+      <w:numFmt w:val="lowerLetter"/>
+      <w:lvlText w:val="%8."/>
+      <w:lvlJc w:val="left"/>
+      <w:pPr>
+        <w:ind w:left="5760" w:hanging="360"/>
+      </w:pPr>
+      <w:rPr/>
+    </w:lvl>
+    <w:lvl w:ilvl="8">
+      <w:start w:val="1"/>
+      <w:numFmt w:val="lowerRoman"/>
+      <w:lvlText w:val="%9."/>
+      <w:lvlJc w:val="right"/>
+      <w:pPr>
+        <w:ind w:left="6480" w:hanging="180"/>
+      </w:pPr>
+      <w:rPr/>
+    </w:lvl>
+  </w:abstractNum>
+  <w:abstractNum w:abstractNumId="6">
+    <w:lvl w:ilvl="0">
+      <w:start w:val="1"/>
+      <w:numFmt w:val="decimal"/>
+      <w:lvlText w:val="%1."/>
+      <w:lvlJc w:val="left"/>
+      <w:pPr>
+        <w:ind w:left="720" w:hanging="360"/>
+      </w:pPr>
+      <w:rPr>
+        <w:sz w:val="20"/>
+        <w:szCs w:val="20"/>
+      </w:rPr>
+    </w:lvl>
+    <w:lvl w:ilvl="1">
+      <w:start w:val="1"/>
+      <w:numFmt w:val="decimal"/>
+      <w:lvlText w:val="%2."/>
+      <w:lvlJc w:val="left"/>
+      <w:pPr>
+        <w:ind w:left="1440" w:hanging="360"/>
+      </w:pPr>
+      <w:rPr/>
+    </w:lvl>
+    <w:lvl w:ilvl="2">
       <w:start w:val="1"/>
       <w:numFmt w:val="bullet"/>
-      <w:lvlText w:val="●"/>
-      <w:lvlJc w:val="left"/>
-      <w:pPr>
-        <w:ind w:left="720" w:hanging="360"/>
+      <w:lvlText w:val="▪"/>
+      <w:lvlJc w:val="left"/>
+      <w:pPr>
+        <w:ind w:left="2160" w:hanging="360"/>
       </w:pPr>
       <w:rPr>
         <w:rFonts w:ascii="Noto Sans Symbols" w:cs="Noto Sans Symbols" w:eastAsia="Noto Sans Symbols" w:hAnsi="Noto Sans Symbols"/>
@@ -5099,27 +5291,13 @@
         <w:szCs w:val="20"/>
       </w:rPr>
     </w:lvl>
-    <w:lvl w:ilvl="1">
-      <w:start w:val="1"/>
-      <w:numFmt w:val="bullet"/>
-      <w:lvlText w:val="o"/>
-      <w:lvlJc w:val="left"/>
-      <w:pPr>
-        <w:ind w:left="1440" w:hanging="360"/>
-      </w:pPr>
-      <w:rPr>
-        <w:rFonts w:ascii="Courier New" w:cs="Courier New" w:eastAsia="Courier New" w:hAnsi="Courier New"/>
-        <w:sz w:val="20"/>
-        <w:szCs w:val="20"/>
-      </w:rPr>
-    </w:lvl>
-    <w:lvl w:ilvl="2">
+    <w:lvl w:ilvl="3">
       <w:start w:val="1"/>
       <w:numFmt w:val="bullet"/>
       <w:lvlText w:val="▪"/>
       <w:lvlJc w:val="left"/>
       <w:pPr>
-        <w:ind w:left="2160" w:hanging="360"/>
+        <w:ind w:left="2880" w:hanging="360"/>
       </w:pPr>
       <w:rPr>
         <w:rFonts w:ascii="Noto Sans Symbols" w:cs="Noto Sans Symbols" w:eastAsia="Noto Sans Symbols" w:hAnsi="Noto Sans Symbols"/>
@@ -5127,13 +5305,13 @@
         <w:szCs w:val="20"/>
       </w:rPr>
     </w:lvl>
-    <w:lvl w:ilvl="3">
+    <w:lvl w:ilvl="4">
       <w:start w:val="1"/>
       <w:numFmt w:val="bullet"/>
       <w:lvlText w:val="▪"/>
       <w:lvlJc w:val="left"/>
       <w:pPr>
-        <w:ind w:left="2880" w:hanging="360"/>
+        <w:ind w:left="3600" w:hanging="360"/>
       </w:pPr>
       <w:rPr>
         <w:rFonts w:ascii="Noto Sans Symbols" w:cs="Noto Sans Symbols" w:eastAsia="Noto Sans Symbols" w:hAnsi="Noto Sans Symbols"/>
@@ -5141,13 +5319,13 @@
         <w:szCs w:val="20"/>
       </w:rPr>
     </w:lvl>
-    <w:lvl w:ilvl="4">
+    <w:lvl w:ilvl="5">
       <w:start w:val="1"/>
       <w:numFmt w:val="bullet"/>
       <w:lvlText w:val="▪"/>
       <w:lvlJc w:val="left"/>
       <w:pPr>
-        <w:ind w:left="3600" w:hanging="360"/>
+        <w:ind w:left="4320" w:hanging="360"/>
       </w:pPr>
       <w:rPr>
         <w:rFonts w:ascii="Noto Sans Symbols" w:cs="Noto Sans Symbols" w:eastAsia="Noto Sans Symbols" w:hAnsi="Noto Sans Symbols"/>
@@ -5155,13 +5333,13 @@
         <w:szCs w:val="20"/>
       </w:rPr>
     </w:lvl>
-    <w:lvl w:ilvl="5">
+    <w:lvl w:ilvl="6">
       <w:start w:val="1"/>
       <w:numFmt w:val="bullet"/>
       <w:lvlText w:val="▪"/>
       <w:lvlJc w:val="left"/>
       <w:pPr>
-        <w:ind w:left="4320" w:hanging="360"/>
+        <w:ind w:left="5040" w:hanging="360"/>
       </w:pPr>
       <w:rPr>
         <w:rFonts w:ascii="Noto Sans Symbols" w:cs="Noto Sans Symbols" w:eastAsia="Noto Sans Symbols" w:hAnsi="Noto Sans Symbols"/>
@@ -5169,13 +5347,13 @@
         <w:szCs w:val="20"/>
       </w:rPr>
     </w:lvl>
-    <w:lvl w:ilvl="6">
+    <w:lvl w:ilvl="7">
       <w:start w:val="1"/>
       <w:numFmt w:val="bullet"/>
       <w:lvlText w:val="▪"/>
       <w:lvlJc w:val="left"/>
       <w:pPr>
-        <w:ind w:left="5040" w:hanging="360"/>
+        <w:ind w:left="5760" w:hanging="360"/>
       </w:pPr>
       <w:rPr>
         <w:rFonts w:ascii="Noto Sans Symbols" w:cs="Noto Sans Symbols" w:eastAsia="Noto Sans Symbols" w:hAnsi="Noto Sans Symbols"/>
@@ -5183,13 +5361,13 @@
         <w:szCs w:val="20"/>
       </w:rPr>
     </w:lvl>
-    <w:lvl w:ilvl="7">
+    <w:lvl w:ilvl="8">
       <w:start w:val="1"/>
       <w:numFmt w:val="bullet"/>
       <w:lvlText w:val="▪"/>
       <w:lvlJc w:val="left"/>
       <w:pPr>
-        <w:ind w:left="5760" w:hanging="360"/>
+        <w:ind w:left="6480" w:hanging="360"/>
       </w:pPr>
       <w:rPr>
         <w:rFonts w:ascii="Noto Sans Symbols" w:cs="Noto Sans Symbols" w:eastAsia="Noto Sans Symbols" w:hAnsi="Noto Sans Symbols"/>
@@ -5197,19 +5375,97 @@
         <w:szCs w:val="20"/>
       </w:rPr>
     </w:lvl>
+  </w:abstractNum>
+  <w:abstractNum w:abstractNumId="7">
+    <w:lvl w:ilvl="0">
+      <w:start w:val="1"/>
+      <w:numFmt w:val="decimal"/>
+      <w:lvlText w:val="%1."/>
+      <w:lvlJc w:val="left"/>
+      <w:pPr>
+        <w:ind w:left="360" w:hanging="360"/>
+      </w:pPr>
+      <w:rPr/>
+    </w:lvl>
+    <w:lvl w:ilvl="1">
+      <w:start w:val="1"/>
+      <w:numFmt w:val="lowerLetter"/>
+      <w:lvlText w:val="%2."/>
+      <w:lvlJc w:val="left"/>
+      <w:pPr>
+        <w:ind w:left="1440" w:hanging="360"/>
+      </w:pPr>
+      <w:rPr/>
+    </w:lvl>
+    <w:lvl w:ilvl="2">
+      <w:start w:val="1"/>
+      <w:numFmt w:val="lowerRoman"/>
+      <w:lvlText w:val="%3."/>
+      <w:lvlJc w:val="right"/>
+      <w:pPr>
+        <w:ind w:left="2160" w:hanging="180"/>
+      </w:pPr>
+      <w:rPr/>
+    </w:lvl>
+    <w:lvl w:ilvl="3">
+      <w:start w:val="1"/>
+      <w:numFmt w:val="decimal"/>
+      <w:lvlText w:val="%4."/>
+      <w:lvlJc w:val="left"/>
+      <w:pPr>
+        <w:ind w:left="2880" w:hanging="360"/>
+      </w:pPr>
+      <w:rPr/>
+    </w:lvl>
+    <w:lvl w:ilvl="4">
+      <w:start w:val="1"/>
+      <w:numFmt w:val="lowerLetter"/>
+      <w:lvlText w:val="%5."/>
+      <w:lvlJc w:val="left"/>
+      <w:pPr>
+        <w:ind w:left="3600" w:hanging="360"/>
+      </w:pPr>
+      <w:rPr/>
+    </w:lvl>
+    <w:lvl w:ilvl="5">
+      <w:start w:val="1"/>
+      <w:numFmt w:val="lowerRoman"/>
+      <w:lvlText w:val="%6."/>
+      <w:lvlJc w:val="right"/>
+      <w:pPr>
+        <w:ind w:left="4320" w:hanging="180"/>
+      </w:pPr>
+      <w:rPr/>
+    </w:lvl>
+    <w:lvl w:ilvl="6">
+      <w:start w:val="1"/>
+      <w:numFmt w:val="decimal"/>
+      <w:lvlText w:val="%7."/>
+      <w:lvlJc w:val="left"/>
+      <w:pPr>
+        <w:ind w:left="5040" w:hanging="360"/>
+      </w:pPr>
+      <w:rPr/>
+    </w:lvl>
+    <w:lvl w:ilvl="7">
+      <w:start w:val="1"/>
+      <w:numFmt w:val="lowerLetter"/>
+      <w:lvlText w:val="%8."/>
+      <w:lvlJc w:val="left"/>
+      <w:pPr>
+        <w:ind w:left="5760" w:hanging="360"/>
+      </w:pPr>
+      <w:rPr/>
+    </w:lvl>
     <w:lvl w:ilvl="8">
       <w:start w:val="1"/>
-      <w:numFmt w:val="bullet"/>
-      <w:lvlText w:val="▪"/>
-      <w:lvlJc w:val="left"/>
-      <w:pPr>
-        <w:ind w:left="6480" w:hanging="360"/>
-      </w:pPr>
-      <w:rPr>
-        <w:rFonts w:ascii="Noto Sans Symbols" w:cs="Noto Sans Symbols" w:eastAsia="Noto Sans Symbols" w:hAnsi="Noto Sans Symbols"/>
-        <w:sz w:val="20"/>
-        <w:szCs w:val="20"/>
-      </w:rPr>
+      <w:numFmt w:val="lowerRoman"/>
+      <w:lvlText w:val="%9."/>
+      <w:lvlJc w:val="right"/>
+      <w:pPr>
+        <w:ind w:left="6480" w:hanging="180"/>
+      </w:pPr>
+      <w:rPr/>
     </w:lvl>
   </w:abstractNum>
   <w:abstractNum w:abstractNumId="8">
@@ -5880,6 +6136,20 @@
       <w:sz w:val="72"/>
       <w:szCs w:val="72"/>
     </w:rPr>
+  </w:style>
+  <w:style w:type="table" w:styleId="TableNormal" w:default="1">
+    <w:name w:val="TableNormal"/>
+    <w:tblPr>
+      <w:tblCellMar>
+        <w:top w:w="100.0" w:type="dxa"/>
+        <w:left w:w="100.0" w:type="dxa"/>
+        <w:bottom w:w="100.0" w:type="dxa"/>
+        <w:right w:w="100.0" w:type="dxa"/>
+      </w:tblCellMar>
+    </w:tblPr>
+  </w:style>
+  <w:style w:type="paragraph" w:styleId="Normal" w:default="1">
+    <w:name w:val="normal"/>
   </w:style>
   <w:style w:type="paragraph" w:styleId="Heading7">
     <w:name w:val="heading 7"/>
@@ -6127,6 +6397,70 @@
       <w:sz w:val="20"/>
       <w:szCs w:val="20"/>
     </w:rPr>
+  </w:style>
+  <w:style w:type="table" w:styleId="Table1">
+    <w:basedOn w:val="TableNormal"/>
+    <w:pPr>
+      <w:spacing w:after="0" w:line="240" w:lineRule="auto"/>
+    </w:pPr>
+    <w:tblPr>
+      <w:tblStyleRowBandSize w:val="1"/>
+      <w:tblStyleColBandSize w:val="1"/>
+      <w:tblCellMar>
+        <w:top w:w="0.0" w:type="dxa"/>
+        <w:left w:w="108.0" w:type="dxa"/>
+        <w:bottom w:w="0.0" w:type="dxa"/>
+        <w:right w:w="108.0" w:type="dxa"/>
+      </w:tblCellMar>
+    </w:tblPr>
+  </w:style>
+  <w:style w:type="table" w:styleId="Table2">
+    <w:basedOn w:val="TableNormal"/>
+    <w:pPr>
+      <w:spacing w:after="0" w:line="240" w:lineRule="auto"/>
+    </w:pPr>
+    <w:tblPr>
+      <w:tblStyleRowBandSize w:val="1"/>
+      <w:tblStyleColBandSize w:val="1"/>
+      <w:tblCellMar>
+        <w:top w:w="0.0" w:type="dxa"/>
+        <w:left w:w="108.0" w:type="dxa"/>
+        <w:bottom w:w="0.0" w:type="dxa"/>
+        <w:right w:w="108.0" w:type="dxa"/>
+      </w:tblCellMar>
+    </w:tblPr>
+  </w:style>
+  <w:style w:type="table" w:styleId="Table3">
+    <w:basedOn w:val="TableNormal"/>
+    <w:pPr>
+      <w:spacing w:after="0" w:line="240" w:lineRule="auto"/>
+    </w:pPr>
+    <w:tblPr>
+      <w:tblStyleRowBandSize w:val="1"/>
+      <w:tblStyleColBandSize w:val="1"/>
+      <w:tblCellMar>
+        <w:top w:w="0.0" w:type="dxa"/>
+        <w:left w:w="108.0" w:type="dxa"/>
+        <w:bottom w:w="0.0" w:type="dxa"/>
+        <w:right w:w="108.0" w:type="dxa"/>
+      </w:tblCellMar>
+    </w:tblPr>
+  </w:style>
+  <w:style w:type="table" w:styleId="Table4">
+    <w:basedOn w:val="TableNormal"/>
+    <w:pPr>
+      <w:spacing w:after="0" w:line="240" w:lineRule="auto"/>
+    </w:pPr>
+    <w:tblPr>
+      <w:tblStyleRowBandSize w:val="1"/>
+      <w:tblStyleColBandSize w:val="1"/>
+      <w:tblCellMar>
+        <w:top w:w="0.0" w:type="dxa"/>
+        <w:left w:w="108.0" w:type="dxa"/>
+        <w:bottom w:w="0.0" w:type="dxa"/>
+        <w:right w:w="108.0" w:type="dxa"/>
+      </w:tblCellMar>
+    </w:tblPr>
   </w:style>
   <w:style w:type="paragraph" w:styleId="Subtitle">
     <w:name w:val="Subtitle"/>
@@ -6477,7 +6811,7 @@
 
 <file path=customXML/item1.xml><?xml version="1.0" encoding="utf-8"?>
 <go:gDocsCustomXmlDataStorage xmlns:go="http://customooxmlschemas.google.com/" xmlns:r="http://schemas.openxmlformats.org/officeDocument/2006/relationships" uri="GoogleDocsCustomDataVersion2">
-  <go:docsCustomData xmlns:go="http://customooxmlschemas.google.com/" roundtripDataSignature="AMtx7mj0xTsJDYKwdCPoWfLpRSrDYyd77A==">CgMxLjA4AHIhMTgzc3NmN1N0cmplWjVGVndZNTlreTFTWVZ0MWpIX1lW</go:docsCustomData>
+  <go:docsCustomData xmlns:go="http://customooxmlschemas.google.com/" roundtripDataSignature="AMtx7mjnrU5KG65fw/xmOm91ffNOiUdN+Q==">CgMxLjA4AHIhMUlhekFmdndCbFhGTHBzeS1MdWFuRkZrOEgzU3hBM3R6</go:docsCustomData>
 </go:gDocsCustomXmlDataStorage>
 </file>
 

</xml_diff>